<commit_message>
codex: complete portable review tools handover
Document both export-first commands and the isolated mapping worker, record the frozen verification and clean release ZIP identity, and regenerate the visually checked walkthrough DOCX.
</commit_message>
<xml_diff>
--- a/docs/docx/leap_review_tools_walkthrough.docx
+++ b/docs/docx/leap_review_tools_walkthrough.docx
@@ -23,7 +23,7 @@
         <w:pStyle w:val="Date"/>
       </w:pPr>
       <w:r>
-        <w:t xml:space="preserve">3 August 2026</w:t>
+        <w:t xml:space="preserve">4 August 2026</w:t>
       </w:r>
     </w:p>
     <w:bookmarkStart w:id="12" w:name="what-this-is"/>
@@ -221,7 +221,7 @@
       <w:r>
         <w:drawing>
           <wp:inline>
-            <wp:extent cx="5334000" cy="5351151"/>
+            <wp:extent cx="5334000" cy="6481822"/>
             <wp:effectExtent b="0" l="0" r="0" t="0"/>
             <wp:docPr descr="" title="" id="10" name="Picture"/>
             <a:graphic>
@@ -242,7 +242,7 @@
                   <pic:spPr bwMode="auto">
                     <a:xfrm>
                       <a:off x="0" y="0"/>
-                      <a:ext cx="5334000" cy="5351151"/>
+                      <a:ext cx="5334000" cy="6481822"/>
                     </a:xfrm>
                     <a:prstGeom prst="rect">
                       <a:avLst/>
@@ -407,7 +407,22 @@
         <w:t xml:space="preserve"> </w:t>
       </w:r>
       <w:r>
-        <w:t xml:space="preserve">not one, and only the second is in the portable release.</w:t>
+        <w:t xml:space="preserve">and</w:t>
+      </w:r>
+      <w:r>
+        <w:t xml:space="preserve"> </w:t>
+      </w:r>
+      <w:r>
+        <w:rPr>
+          <w:rStyle w:val="VerbatimChar"/>
+        </w:rPr>
+        <w:t xml:space="preserve">balance-review-from-export</w:t>
+      </w:r>
+      <w:r>
+        <w:t xml:space="preserve"> </w:t>
+      </w:r>
+      <w:r>
+        <w:t xml:space="preserve">runs both in developer and portable modes.</w:t>
       </w:r>
     </w:p>
     <w:p>
@@ -536,44 +551,25 @@
         <w:pStyle w:val="BodyText"/>
       </w:pPr>
       <w:r>
-        <w:t xml:space="preserve">The portable release ships step 2 only, and the reason is</w:t>
-      </w:r>
-      <w:r>
-        <w:t xml:space="preserve"> </w:t>
-      </w:r>
-      <w:r>
-        <w:rPr>
-          <w:b/>
-          <w:bCs/>
-        </w:rPr>
-        <w:t xml:space="preserve">data size</w:t>
-      </w:r>
-      <w:r>
-        <w:t xml:space="preserve">: step 1</w:t>
-      </w:r>
-      <w:r>
-        <w:t xml:space="preserve"> </w:t>
-      </w:r>
-      <w:r>
-        <w:t xml:space="preserve">reads 314 MB of source tables, which would take the download from roughly</w:t>
-      </w:r>
-      <w:r>
-        <w:t xml:space="preserve"> </w:t>
-      </w:r>
-      <w:r>
-        <w:t xml:space="preserve">110 MB to roughly 450 MB. Step 1 is otherwise read-only with no LEAP COM</w:t>
-      </w:r>
-      <w:r>
-        <w:t xml:space="preserve"> </w:t>
-      </w:r>
-      <w:r>
-        <w:t xml:space="preserve">dependency at run time, so including it is a size decision rather than a</w:t>
-      </w:r>
-      <w:r>
-        <w:t xml:space="preserve"> </w:t>
-      </w:r>
-      <w:r>
-        <w:t xml:space="preserve">technical blocker.</w:t>
+        <w:t xml:space="preserve">The portable release ships both steps. It is consequently large: step 1 needs</w:t>
+      </w:r>
+      <w:r>
+        <w:t xml:space="preserve"> </w:t>
+      </w:r>
+      <w:r>
+        <w:t xml:space="preserve">the ESTO base table and the all-economy 9th-edition projection table. Those</w:t>
+      </w:r>
+      <w:r>
+        <w:t xml:space="preserve"> </w:t>
+      </w:r>
+      <w:r>
+        <w:t xml:space="preserve">read-only inputs are pinned by SHA-256 in the release manifest, and neither step</w:t>
+      </w:r>
+      <w:r>
+        <w:t xml:space="preserve"> </w:t>
+      </w:r>
+      <w:r>
+        <w:t xml:space="preserve">needs LEAP COM or a results-update run.</w:t>
       </w:r>
     </w:p>
     <w:p>
@@ -760,7 +756,7 @@
       <w:r>
         <w:drawing>
           <wp:inline>
-            <wp:extent cx="5334000" cy="2007053"/>
+            <wp:extent cx="5334000" cy="1592035"/>
             <wp:effectExtent b="0" l="0" r="0" t="0"/>
             <wp:docPr descr="" title="" id="18" name="Picture"/>
             <a:graphic>
@@ -781,7 +777,7 @@
                   <pic:spPr bwMode="auto">
                     <a:xfrm>
                       <a:off x="0" y="0"/>
-                      <a:ext cx="5334000" cy="2007053"/>
+                      <a:ext cx="5334000" cy="1592035"/>
                     </a:xfrm>
                     <a:prstGeom prst="rect">
                       <a:avLst/>
@@ -805,32 +801,49 @@
         <w:pStyle w:val="BodyText"/>
       </w:pPr>
       <w:r>
-        <w:t xml:space="preserve">The comparison file is close to a gigabyte for the full economy set, so it is a</w:t>
-      </w:r>
-      <w:r>
-        <w:t xml:space="preserve"> </w:t>
-      </w:r>
-      <w:r>
-        <w:rPr>
-          <w:b/>
-          <w:bCs/>
-        </w:rPr>
-        <w:t xml:space="preserve">run input</w:t>
-      </w:r>
-      <w:r>
-        <w:t xml:space="preserve">, not part of the package. Validation streams it row by row rather</w:t>
-      </w:r>
-      <w:r>
-        <w:t xml:space="preserve"> </w:t>
-      </w:r>
-      <w:r>
-        <w:t xml:space="preserve">than loading it, so asking for an economy it does not contain is reported in</w:t>
-      </w:r>
-      <w:r>
-        <w:t xml:space="preserve"> </w:t>
-      </w:r>
-      <w:r>
-        <w:t xml:space="preserve">seconds rather than after a long load.</w:t>
+        <w:rPr>
+          <w:rStyle w:val="VerbatimChar"/>
+        </w:rPr>
+        <w:t xml:space="preserve">dashboard-from-export</w:t>
+      </w:r>
+      <w:r>
+        <w:t xml:space="preserve"> </w:t>
+      </w:r>
+      <w:r>
+        <w:t xml:space="preserve">avoids transferring the full all-economy comparison</w:t>
+      </w:r>
+      <w:r>
+        <w:t xml:space="preserve"> </w:t>
+      </w:r>
+      <w:r>
+        <w:t xml:space="preserve">file: the isolated mapping worker builds the requested economy’s comparison</w:t>
+      </w:r>
+      <w:r>
+        <w:t xml:space="preserve"> </w:t>
+      </w:r>
+      <w:r>
+        <w:t xml:space="preserve">data from the exports. The older</w:t>
+      </w:r>
+      <w:r>
+        <w:t xml:space="preserve"> </w:t>
+      </w:r>
+      <w:r>
+        <w:rPr>
+          <w:rStyle w:val="VerbatimChar"/>
+        </w:rPr>
+        <w:t xml:space="preserve">dashboard</w:t>
+      </w:r>
+      <w:r>
+        <w:t xml:space="preserve"> </w:t>
+      </w:r>
+      <w:r>
+        <w:t xml:space="preserve">command remains as an escape hatch</w:t>
+      </w:r>
+      <w:r>
+        <w:t xml:space="preserve"> </w:t>
+      </w:r>
+      <w:r>
+        <w:t xml:space="preserve">for an existing comparison file.</w:t>
       </w:r>
     </w:p>
     <w:p>
@@ -2111,6 +2124,15 @@
         <w:rPr>
           <w:rStyle w:val="VerbatimChar"/>
         </w:rPr>
+        <w:t xml:space="preserve">  mapping-chain/             isolated mapping worker executable + runtime</w:t>
+      </w:r>
+      <w:r>
+        <w:br/>
+      </w:r>
+      <w:r>
+        <w:rPr>
+          <w:rStyle w:val="VerbatimChar"/>
+        </w:rPr>
         <w:t xml:space="preserve">  config/                    approved mapping and template files — editable</w:t>
       </w:r>
       <w:r>
@@ -2120,6 +2142,15 @@
         <w:rPr>
           <w:rStyle w:val="VerbatimChar"/>
         </w:rPr>
+        <w:t xml:space="preserve">  data/                      pinned source tables and mapping artifacts</w:t>
+      </w:r>
+      <w:r>
+        <w:br/>
+      </w:r>
+      <w:r>
+        <w:rPr>
+          <w:rStyle w:val="VerbatimChar"/>
+        </w:rPr>
         <w:t xml:space="preserve">  input/                     put your input files here</w:t>
       </w:r>
       <w:r>
@@ -2230,6 +2261,23 @@
         <w:rPr>
           <w:rStyle w:val="NormalTok"/>
         </w:rPr>
+        <w:t xml:space="preserve"> list</w:t>
+      </w:r>
+    </w:p>
+    <w:p>
+      <w:pPr>
+        <w:pStyle w:val="SourceCode"/>
+      </w:pPr>
+      <w:r>
+        <w:rPr>
+          <w:rStyle w:val="ExtensionTok"/>
+        </w:rPr>
+        <w:t xml:space="preserve">leap-review-tools.exe</w:t>
+      </w:r>
+      <w:r>
+        <w:rPr>
+          <w:rStyle w:val="NormalTok"/>
+        </w:rPr>
         <w:t xml:space="preserve"> balance-review </w:t>
       </w:r>
       <w:r>
@@ -2380,6 +2428,111 @@
           <w:rStyle w:val="StringTok"/>
         </w:rPr>
         <w:t xml:space="preserve">"input\common_esto_rows.csv"</w:t>
+      </w:r>
+    </w:p>
+    <w:p>
+      <w:pPr>
+        <w:pStyle w:val="FirstParagraph"/>
+      </w:pPr>
+      <w:r>
+        <w:t xml:space="preserve">For the usual export-first workflow, place workbooks under</w:t>
+      </w:r>
+      <w:r>
+        <w:t xml:space="preserve"> </w:t>
+      </w:r>
+      <w:r>
+        <w:rPr>
+          <w:rStyle w:val="VerbatimChar"/>
+        </w:rPr>
+        <w:t xml:space="preserve">input\leap balances exports\&lt;ECONOMY&gt;\</w:t>
+      </w:r>
+      <w:r>
+        <w:t xml:space="preserve"> </w:t>
+      </w:r>
+      <w:r>
+        <w:t xml:space="preserve">and run:</w:t>
+      </w:r>
+    </w:p>
+    <w:p>
+      <w:pPr>
+        <w:pStyle w:val="SourceCode"/>
+      </w:pPr>
+      <w:r>
+        <w:rPr>
+          <w:rStyle w:val="ExtensionTok"/>
+        </w:rPr>
+        <w:t xml:space="preserve">leap-review-tools.exe</w:t>
+      </w:r>
+      <w:r>
+        <w:rPr>
+          <w:rStyle w:val="NormalTok"/>
+        </w:rPr>
+        <w:t xml:space="preserve"> balance-review-from-export </w:t>
+      </w:r>
+      <w:r>
+        <w:rPr>
+          <w:rStyle w:val="AttributeTok"/>
+        </w:rPr>
+        <w:t xml:space="preserve">--economy</w:t>
+      </w:r>
+      <w:r>
+        <w:rPr>
+          <w:rStyle w:val="NormalTok"/>
+        </w:rPr>
+        <w:t xml:space="preserve"> 20_USA </w:t>
+      </w:r>
+      <w:r>
+        <w:rPr>
+          <w:rStyle w:val="AttributeTok"/>
+        </w:rPr>
+        <w:t xml:space="preserve">--scenario</w:t>
+      </w:r>
+      <w:r>
+        <w:rPr>
+          <w:rStyle w:val="NormalTok"/>
+        </w:rPr>
+        <w:t xml:space="preserve"> Target </w:t>
+      </w:r>
+      <w:r>
+        <w:rPr>
+          <w:rStyle w:val="AttributeTok"/>
+        </w:rPr>
+        <w:t xml:space="preserve">--year</w:t>
+      </w:r>
+      <w:r>
+        <w:rPr>
+          <w:rStyle w:val="NormalTok"/>
+        </w:rPr>
+        <w:t xml:space="preserve"> 2022</w:t>
+      </w:r>
+    </w:p>
+    <w:p>
+      <w:pPr>
+        <w:pStyle w:val="SourceCode"/>
+      </w:pPr>
+      <w:r>
+        <w:rPr>
+          <w:rStyle w:val="ExtensionTok"/>
+        </w:rPr>
+        <w:t xml:space="preserve">leap-review-tools.exe</w:t>
+      </w:r>
+      <w:r>
+        <w:rPr>
+          <w:rStyle w:val="NormalTok"/>
+        </w:rPr>
+        <w:t xml:space="preserve"> dashboard-from-export </w:t>
+      </w:r>
+      <w:r>
+        <w:rPr>
+          <w:rStyle w:val="AttributeTok"/>
+        </w:rPr>
+        <w:t xml:space="preserve">--economy</w:t>
+      </w:r>
+      <w:r>
+        <w:rPr>
+          <w:rStyle w:val="NormalTok"/>
+        </w:rPr>
+        <w:t xml:space="preserve"> 20_USA</w:t>
       </w:r>
     </w:p>
     <w:p>
@@ -2806,6 +2959,168 @@
           </w:p>
         </w:tc>
       </w:tr>
+      <w:tr>
+        <w:tc>
+          <w:tcPr/>
+          <w:p>
+            <w:pPr>
+              <w:pStyle w:val="Compact"/>
+            </w:pPr>
+            <w:r>
+              <w:rPr>
+                <w:rStyle w:val="VerbatimChar"/>
+              </w:rPr>
+              <w:t xml:space="preserve">config/mappings/outlook_mappings_master.xlsx</w:t>
+            </w:r>
+          </w:p>
+        </w:tc>
+        <w:tc>
+          <w:tcPr/>
+          <w:p>
+            <w:pPr>
+              <w:pStyle w:val="Compact"/>
+            </w:pPr>
+            <w:r>
+              <w:t xml:space="preserve">canonical LEAP-to-ESTO mappings</w:t>
+            </w:r>
+          </w:p>
+        </w:tc>
+      </w:tr>
+      <w:tr>
+        <w:tc>
+          <w:tcPr/>
+          <w:p>
+            <w:pPr>
+              <w:pStyle w:val="Compact"/>
+            </w:pPr>
+            <w:r>
+              <w:rPr>
+                <w:rStyle w:val="VerbatimChar"/>
+              </w:rPr>
+              <w:t xml:space="preserve">config/mappings/source_branch_fallback_rules.csv</w:t>
+            </w:r>
+          </w:p>
+        </w:tc>
+        <w:tc>
+          <w:tcPr/>
+          <w:p>
+            <w:pPr>
+              <w:pStyle w:val="Compact"/>
+            </w:pPr>
+            <w:r>
+              <w:t xml:space="preserve">interim-branch fallback rules</w:t>
+            </w:r>
+          </w:p>
+        </w:tc>
+      </w:tr>
+      <w:tr>
+        <w:tc>
+          <w:tcPr/>
+          <w:p>
+            <w:pPr>
+              <w:pStyle w:val="Compact"/>
+            </w:pPr>
+            <w:r>
+              <w:rPr>
+                <w:rStyle w:val="VerbatimChar"/>
+              </w:rPr>
+              <w:t xml:space="preserve">config/balance_review/synthetic_reference_rows.csv</w:t>
+            </w:r>
+          </w:p>
+        </w:tc>
+        <w:tc>
+          <w:tcPr/>
+          <w:p>
+            <w:pPr>
+              <w:pStyle w:val="Compact"/>
+            </w:pPr>
+            <w:r>
+              <w:t xml:space="preserve">ESTO vintage-alignment rows</w:t>
+            </w:r>
+          </w:p>
+        </w:tc>
+      </w:tr>
+      <w:tr>
+        <w:tc>
+          <w:tcPr/>
+          <w:p>
+            <w:pPr>
+              <w:pStyle w:val="Compact"/>
+            </w:pPr>
+            <w:r>
+              <w:rPr>
+                <w:rStyle w:val="VerbatimChar"/>
+              </w:rPr>
+              <w:t xml:space="preserve">config/balance_review/leap_results_sheet_map.csv</w:t>
+            </w:r>
+          </w:p>
+        </w:tc>
+        <w:tc>
+          <w:tcPr/>
+          <w:p>
+            <w:pPr>
+              <w:pStyle w:val="Compact"/>
+            </w:pPr>
+            <w:r>
+              <w:t xml:space="preserve">LEAP sheet/scenario resolution</w:t>
+            </w:r>
+          </w:p>
+        </w:tc>
+      </w:tr>
+      <w:tr>
+        <w:tc>
+          <w:tcPr/>
+          <w:p>
+            <w:pPr>
+              <w:pStyle w:val="Compact"/>
+            </w:pPr>
+            <w:r>
+              <w:rPr>
+                <w:rStyle w:val="VerbatimChar"/>
+              </w:rPr>
+              <w:t xml:space="preserve">config/balance_review/leap_explicit_reassignments.csv</w:t>
+            </w:r>
+          </w:p>
+        </w:tc>
+        <w:tc>
+          <w:tcPr/>
+          <w:p>
+            <w:pPr>
+              <w:pStyle w:val="Compact"/>
+            </w:pPr>
+            <w:r>
+              <w:t xml:space="preserve">reviewed balance-row reassignments</w:t>
+            </w:r>
+          </w:p>
+        </w:tc>
+      </w:tr>
+      <w:tr>
+        <w:tc>
+          <w:tcPr/>
+          <w:p>
+            <w:pPr>
+              <w:pStyle w:val="Compact"/>
+            </w:pPr>
+            <w:r>
+              <w:rPr>
+                <w:rStyle w:val="VerbatimChar"/>
+              </w:rPr>
+              <w:t xml:space="preserve">config/balance_review/balance_error_signal_rules.csv</w:t>
+            </w:r>
+          </w:p>
+        </w:tc>
+        <w:tc>
+          <w:tcPr/>
+          <w:p>
+            <w:pPr>
+              <w:pStyle w:val="Compact"/>
+            </w:pPr>
+            <w:r>
+              <w:t xml:space="preserve">variable roles and error-signal rules</w:t>
+            </w:r>
+          </w:p>
+        </w:tc>
+      </w:tr>
     </w:tbl>
     <w:p>
       <w:pPr>
@@ -2850,7 +3165,7 @@
       <w:r>
         <w:drawing>
           <wp:inline>
-            <wp:extent cx="5334000" cy="3143250"/>
+            <wp:extent cx="5334000" cy="2177142"/>
             <wp:effectExtent b="0" l="0" r="0" t="0"/>
             <wp:docPr descr="" title="" id="36" name="Picture"/>
             <a:graphic>
@@ -2871,7 +3186,7 @@
                   <pic:spPr bwMode="auto">
                     <a:xfrm>
                       <a:off x="0" y="0"/>
-                      <a:ext cx="5334000" cy="3143250"/>
+                      <a:ext cx="5334000" cy="2177142"/>
                     </a:xfrm>
                     <a:prstGeom prst="rect">
                       <a:avLst/>
@@ -2895,13 +3210,13 @@
         <w:pStyle w:val="BodyText"/>
       </w:pPr>
       <w:r>
-        <w:t xml:space="preserve">The canonical mapping workbooks themselves are never embedded in the executable</w:t>
-      </w:r>
-      <w:r>
-        <w:t xml:space="preserve"> </w:t>
-      </w:r>
-      <w:r>
-        <w:t xml:space="preserve">and are not edited by any of this. Update them in</w:t>
+        <w:t xml:space="preserve">The canonical mapping workbook is packaged beside the executables as a</w:t>
+      </w:r>
+      <w:r>
+        <w:t xml:space="preserve"> </w:t>
+      </w:r>
+      <w:r>
+        <w:t xml:space="preserve">configuration asset, and neither command edits it. Make maintained changes in</w:t>
       </w:r>
       <w:r>
         <w:t xml:space="preserve"> </w:t>
@@ -2913,10 +3228,13 @@
         <w:t xml:space="preserve">leap_mappings</w:t>
       </w:r>
       <w:r>
-        <w:t xml:space="preserve"> </w:t>
-      </w:r>
-      <w:r>
-        <w:t xml:space="preserve">as normal.</w:t>
+        <w:t xml:space="preserve">, regenerate the pinned mapping artifacts, and build a new</w:t>
+      </w:r>
+      <w:r>
+        <w:t xml:space="preserve"> </w:t>
+      </w:r>
+      <w:r>
+        <w:t xml:space="preserve">release so the workbook and data snapshots stay consistent.</w:t>
       </w:r>
     </w:p>
     <w:p>
@@ -3000,7 +3318,7 @@
       <w:r>
         <w:drawing>
           <wp:inline>
-            <wp:extent cx="5334000" cy="9627053"/>
+            <wp:extent cx="5334000" cy="823232"/>
             <wp:effectExtent b="0" l="0" r="0" t="0"/>
             <wp:docPr descr="" title="" id="40" name="Picture"/>
             <a:graphic>
@@ -3021,7 +3339,7 @@
                   <pic:spPr bwMode="auto">
                     <a:xfrm>
                       <a:off x="0" y="0"/>
-                      <a:ext cx="5334000" cy="9627053"/>
+                      <a:ext cx="5334000" cy="823232"/>
                     </a:xfrm>
                     <a:prstGeom prst="rect">
                       <a:avLst/>
@@ -3093,7 +3411,7 @@
           <w:b/>
           <w:bCs/>
         </w:rPr>
-        <w:t xml:space="preserve">PyInstaller runs in a subprocess, from a directory containing none of the</w:t>
+        <w:t xml:space="preserve">PyInstaller builds two isolated targets from a directory containing none of</w:t>
       </w:r>
       <w:r>
         <w:rPr>
@@ -3107,25 +3425,13 @@
           <w:b/>
           <w:bCs/>
         </w:rPr>
-        <w:t xml:space="preserve">repositories.</w:t>
-      </w:r>
-      <w:r>
-        <w:t xml:space="preserve"> </w:t>
-      </w:r>
-      <w:r>
-        <w:t xml:space="preserve">PyInstaller resolves imports through the build process’s own</w:t>
-      </w:r>
-      <w:r>
-        <w:t xml:space="preserve"> </w:t>
-      </w:r>
-      <w:r>
-        <w:t xml:space="preserve">import environment as well as the spec. Running it in-process from a checkout</w:t>
-      </w:r>
-      <w:r>
-        <w:t xml:space="preserve"> </w:t>
-      </w:r>
-      <w:r>
-        <w:t xml:space="preserve">silently baked the maintainer’s live</w:t>
+        <w:t xml:space="preserve">the repositories.</w:t>
+      </w:r>
+      <w:r>
+        <w:t xml:space="preserve"> </w:t>
+      </w:r>
+      <w:r>
+        <w:t xml:space="preserve">Both source repositories use the top-level package name</w:t>
       </w:r>
       <w:r>
         <w:t xml:space="preserve"> </w:t>
@@ -3137,22 +3443,13 @@
         <w:t xml:space="preserve">codebase</w:t>
       </w:r>
       <w:r>
-        <w:t xml:space="preserve"> </w:t>
-      </w:r>
-      <w:r>
-        <w:t xml:space="preserve">package into the executable,</w:t>
-      </w:r>
-      <w:r>
-        <w:t xml:space="preserve"> </w:t>
-      </w:r>
-      <w:r>
-        <w:t xml:space="preserve">which then failed at start-up on a machine with no LEAP COM API. Isolation fixes</w:t>
-      </w:r>
-      <w:r>
-        <w:t xml:space="preserve"> </w:t>
-      </w:r>
-      <w:r>
-        <w:t xml:space="preserve">this; the</w:t>
+        <w:t xml:space="preserve">, so they cannot safely share one Python process or executable. The</w:t>
+      </w:r>
+      <w:r>
+        <w:t xml:space="preserve"> </w:t>
+      </w:r>
+      <w:r>
+        <w:t xml:space="preserve">main executable bundles</w:t>
       </w:r>
       <w:r>
         <w:t xml:space="preserve"> </w:t>
@@ -3161,13 +3458,46 @@
         <w:rPr>
           <w:rStyle w:val="VerbatimChar"/>
         </w:rPr>
-        <w:t xml:space="preserve">selfcheck</w:t>
-      </w:r>
-      <w:r>
-        <w:t xml:space="preserve"> </w:t>
-      </w:r>
-      <w:r>
-        <w:t xml:space="preserve">step catches it if it ever recurs.</w:t>
+        <w:t xml:space="preserve">leap_initialisation</w:t>
+      </w:r>
+      <w:r>
+        <w:t xml:space="preserve"> </w:t>
+      </w:r>
+      <w:r>
+        <w:t xml:space="preserve">and dashboard code; the mapping</w:t>
+      </w:r>
+      <w:r>
+        <w:t xml:space="preserve"> </w:t>
+      </w:r>
+      <w:r>
+        <w:t xml:space="preserve">worker bundles</w:t>
+      </w:r>
+      <w:r>
+        <w:t xml:space="preserve"> </w:t>
+      </w:r>
+      <w:r>
+        <w:rPr>
+          <w:rStyle w:val="VerbatimChar"/>
+        </w:rPr>
+        <w:t xml:space="preserve">leap_mappings</w:t>
+      </w:r>
+      <w:r>
+        <w:t xml:space="preserve"> </w:t>
+      </w:r>
+      <w:r>
+        <w:t xml:space="preserve">and exchanges one JSON job/result with the main</w:t>
+      </w:r>
+      <w:r>
+        <w:t xml:space="preserve"> </w:t>
+      </w:r>
+      <w:r>
+        <w:t xml:space="preserve">process. Build isolation also prevents a maintainer’s live checkout from being</w:t>
+      </w:r>
+      <w:r>
+        <w:t xml:space="preserve"> </w:t>
+      </w:r>
+      <w:r>
+        <w:t xml:space="preserve">silently included.</w:t>
       </w:r>
     </w:p>
     <w:bookmarkStart w:id="42" w:name="validation-is-strict-on-purpose"/>
@@ -3564,47 +3894,25 @@
           <w:b/>
           <w:bCs/>
         </w:rPr>
-        <w:t xml:space="preserve">The balance-diagnostics step is developer-mode only, for size reasons.</w:t>
-      </w:r>
-      <w:r>
-        <w:t xml:space="preserve"> </w:t>
-      </w:r>
-      <w:r>
-        <w:t xml:space="preserve">A</w:t>
-      </w:r>
-      <w:r>
-        <w:t xml:space="preserve"> </w:t>
-      </w:r>
-      <w:r>
-        <w:t xml:space="preserve">release builds a workbook from an existing diagnostics folder; it does not</w:t>
-      </w:r>
-      <w:r>
-        <w:t xml:space="preserve"> </w:t>
-      </w:r>
-      <w:r>
-        <w:t xml:space="preserve">generate one from a LEAP export, because that needs 314 MB of source tables.</w:t>
-      </w:r>
-      <w:r>
-        <w:t xml:space="preserve"> </w:t>
-      </w:r>
-      <w:r>
-        <w:t xml:space="preserve">A reconciliation run is</w:t>
-      </w:r>
-      <w:r>
-        <w:t xml:space="preserve"> </w:t>
-      </w:r>
-      <w:r>
-        <w:rPr>
-          <w:i/>
-          <w:iCs/>
-        </w:rPr>
-        <w:t xml:space="preserve">not</w:t>
-      </w:r>
-      <w:r>
-        <w:t xml:space="preserve"> </w:t>
-      </w:r>
-      <w:r>
-        <w:t xml:space="preserve">required for either.</w:t>
+        <w:t xml:space="preserve">The package is large.</w:t>
+      </w:r>
+      <w:r>
+        <w:t xml:space="preserve"> </w:t>
+      </w:r>
+      <w:r>
+        <w:t xml:space="preserve">The export-first commands require the ESTO and</w:t>
+      </w:r>
+      <w:r>
+        <w:t xml:space="preserve"> </w:t>
+      </w:r>
+      <w:r>
+        <w:t xml:space="preserve">9th-edition source tables plus four mapping artifacts. These are snapshots;</w:t>
+      </w:r>
+      <w:r>
+        <w:t xml:space="preserve"> </w:t>
+      </w:r>
+      <w:r>
+        <w:t xml:space="preserve">refreshing their vintages or mappings requires a newly built release.</w:t>
       </w:r>
     </w:p>
     <w:p>
@@ -3684,13 +3992,13 @@
         <w:t xml:space="preserve"> </w:t>
       </w:r>
       <w:r>
-        <w:t xml:space="preserve">The release renders from the comparison data it</w:t>
-      </w:r>
-      <w:r>
-        <w:t xml:space="preserve"> </w:t>
-      </w:r>
-      <w:r>
-        <w:t xml:space="preserve">is given; it never recomputes it.</w:t>
+        <w:t xml:space="preserve">The release computes model-run-specific results</w:t>
+      </w:r>
+      <w:r>
+        <w:t xml:space="preserve"> </w:t>
+      </w:r>
+      <w:r>
+        <w:t xml:space="preserve">from exports but does not download or regenerate its pinned reference data.</w:t>
       </w:r>
     </w:p>
     <w:p>
@@ -3862,13 +4170,13 @@
         <w:t xml:space="preserve"> </w:t>
       </w:r>
       <w:r>
-        <w:t xml:space="preserve">runtime and nothing else executable; and both supported commands run from the</w:t>
-      </w:r>
-      <w:r>
-        <w:t xml:space="preserve"> </w:t>
-      </w:r>
-      <w:r>
-        <w:t xml:space="preserve">frozen executable, whose bundle has no Node.js in it.</w:t>
+        <w:t xml:space="preserve">runtime and nothing else executable; and all four declared command variants run</w:t>
+      </w:r>
+      <w:r>
+        <w:t xml:space="preserve"> </w:t>
+      </w:r>
+      <w:r>
+        <w:t xml:space="preserve">from the frozen package, whose bundles contain no Node.js.</w:t>
       </w:r>
     </w:p>
     <w:bookmarkEnd w:id="48"/>
@@ -4063,7 +4371,7 @@
               <w:pStyle w:val="Compact"/>
             </w:pPr>
             <w:r>
-              <w:t xml:space="preserve">Module and config a release consumes from mappings</w:t>
+              <w:t xml:space="preserve">Isolated mapping worker</w:t>
             </w:r>
           </w:p>
         </w:tc>
@@ -4077,19 +4385,55 @@
               <w:rPr>
                 <w:rStyle w:val="VerbatimChar"/>
               </w:rPr>
-              <w:t xml:space="preserve">leap_mappings/codebase/mapping_tools/source_branch_preflight.py</w:t>
-            </w:r>
-            <w:r>
-              <w:t xml:space="preserve">,</w:t>
+              <w:t xml:space="preserve">leap_mappings/codebase/portable_mapping_chain.py</w:t>
             </w:r>
             <w:r>
               <w:t xml:space="preserve"> </w:t>
             </w:r>
+            <w:r>
+              <w:t xml:space="preserve">and its allowlisted mapping-tool closure</w:t>
+            </w:r>
+          </w:p>
+        </w:tc>
+      </w:tr>
+      <w:tr>
+        <w:tc>
+          <w:tcPr/>
+          <w:p>
+            <w:pPr>
+              <w:pStyle w:val="Compact"/>
+            </w:pPr>
+            <w:r>
+              <w:t xml:space="preserve">Mapping configuration and generated artifacts</w:t>
+            </w:r>
+          </w:p>
+        </w:tc>
+        <w:tc>
+          <w:tcPr/>
+          <w:p>
+            <w:pPr>
+              <w:pStyle w:val="Compact"/>
+            </w:pPr>
             <w:r>
               <w:rPr>
                 <w:rStyle w:val="VerbatimChar"/>
               </w:rPr>
-              <w:t xml:space="preserve">leap_mappings/config/all_demand_aggregated_components.json</w:t>
+              <w:t xml:space="preserve">leap_mappings/config/</w:t>
+            </w:r>
+            <w:r>
+              <w:t xml:space="preserve"> </w:t>
+            </w:r>
+            <w:r>
+              <w:t xml:space="preserve">and the manifest-declared files under</w:t>
+            </w:r>
+            <w:r>
+              <w:t xml:space="preserve"> </w:t>
+            </w:r>
+            <w:r>
+              <w:rPr>
+                <w:rStyle w:val="VerbatimChar"/>
+              </w:rPr>
+              <w:t xml:space="preserve">leap_mappings/results/</w:t>
             </w:r>
           </w:p>
         </w:tc>

</xml_diff>